<commit_message>
Test code update: 0515
</commit_message>
<xml_diff>
--- a/source/ReportExtension/Layouts/Rep10073ext.NACSalesCrMemoEmail.docx
+++ b/source/ReportExtension/Layouts/Rep10073ext.NACSalesCrMemoEmail.docx
@@ -3088,167 +3088,328 @@
 <b:Sources xmlns:b="http://schemas.openxmlformats.org/officeDocument/2006/bibliography" xmlns="http://schemas.openxmlformats.org/officeDocument/2006/bibliography" SelectedStyle="\APASixthEditionOfficeOnline.xsl" StyleName="APA" Version="6"/>
 </file>
 
-<file path=customXml/item3.xml>��< ? x m l   v e r s i o n = " 1 . 0 "   e n c o d i n g = " u t f - 1 6 " ? > 
- < N a v W o r d R e p o r t X m l P a r t   x m l n s = " u r n : m i c r o s o f t - d y n a m i c s - n a v / r e p o r t s / S a l e s _ C r e d i t _ M e m o _ N A / 1 0 0 7 3 / " > 
-     < B C R e p o r t I n f o r m a t i o n > 
-         < R e p o r t M e t a d a t a > 
-             < E x t e n s i o n I d > E x t e n s i o n   I D < / E x t e n s i o n I d > 
-             < E x t e n s i o n N a m e > E x t e n s i o n   N a m e < / E x t e n s i o n N a m e > 
-             < E x t e n s i o n P u b l i s h e r > E x t e n s i o n   P u b l i s h e r < / E x t e n s i o n P u b l i s h e r > 
-             < E x t e n s i o n V e r s i o n > E x t e n s i o n   V e r s i o n < / E x t e n s i o n V e r s i o n > 
-             < R e p o r t I d > R e p o r t   I D < / R e p o r t I d > 
-             < R e p o r t N a m e > R e p o r t   N a m e < / R e p o r t N a m e > 
-             < A b o u t T h i s R e p o r t T i t l e > A b o u t   T h i s   R e p o r t   T i t l e < / A b o u t T h i s R e p o r t T i t l e > 
-             < A b o u t T h i s R e p o r t T e x t > A b o u t   T h i s   R e p o r t   T e x t < / A b o u t T h i s R e p o r t T e x t > 
-             < R e p o r t H e l p L i n k > R e p o r t   H e l p   L i n k < / R e p o r t H e l p L i n k > 
-         < / R e p o r t M e t a d a t a > 
-         < R e p o r t R e q u e s t > 
-             < T e n a n t E n t r a I d > T e n a n t   E n t r a   I d < / T e n a n t E n t r a I d > 
-             < E n v i r o n m e n t N a m e > E n v i r o n m e n t   N a m e < / E n v i r o n m e n t N a m e > 
-             < E n v i r o n m e n t T y p e > E n v i r o n m e n t   T y p e < / E n v i r o n m e n t T y p e > 
-             < C o m p a n y N a m e > C o m p a n y   N a m e < / C o m p a n y N a m e > 
-             < C o m p a n y D i s p l a y N a m e > C o m p a n y   D i s p l a y   N a m e < / C o m p a n y D i s p l a y N a m e > 
-             < C o m p a n y I d > C o m p a n y   I D < / C o m p a n y I d > 
-             < U s e r N a m e > U s e r   N a m e < / U s e r N a m e > 
-             < D a t e A n d T i m e > D a t e   a n d   T i m e < / D a t e A n d T i m e > 
-             < L a n g u a g e > L a n g u a g e < / L a n g u a g e > 
-             < F o r m a t R e g i o n > F o r m a t   R e g i o n < / F o r m a t R e g i o n > 
-             < D a t e T i m e V a l u e s > 
-                 < Y e a r > Y e a r < / Y e a r > 
-                 < M o n t h N u m b e r > M o n t h   N u m b e r < / M o n t h N u m b e r > 
-                 < D a y N u m b e r > D a y   N u m b e r < / D a y N u m b e r > 
-                 < H o u r > H o u r < / H o u r > 
-                 < M i n u t e > M i n u t e < / M i n u t e > 
-             < / D a t e T i m e V a l u e s > 
-         < / R e p o r t R e q u e s t > 
-     < / B C R e p o r t I n f o r m a t i o n > 
-     < S a l e s _ C r _ M e m o _ H e a d e r > 
-         < N o _ S a l e s C r M e m o H e a d e r > N o _ S a l e s C r M e m o H e a d e r < / N o _ S a l e s C r M e m o H e a d e r > 
-         < N o _ S a l e s H e a d e r > N o _ S a l e s H e a d e r < / N o _ S a l e s H e a d e r > 
-         < S a l e s _ C r _ M e m o _ L i n e > 
-             < S a l e s L i n e C o m m e n t s   / > 
-         < / S a l e s _ C r _ M e m o _ L i n e > 
-         < S a l e s _ C o m m e n t _ L i n e   / > 
-         < C o p y L o o p > 
-             < P a g e L o o p > 
-                 < A p p l D o c N o _ S a l e s C r M e m o H e a d e r > A p p l D o c N o _ S a l e s C r M e m o H e a d e r < / A p p l D o c N o _ S a l e s C r M e m o H e a d e r > 
-                 < A p p l D o c T y p e _ S a l e s C r M e m o H e a d e r > A p p l D o c T y p e _ S a l e s C r M e m o H e a d e r < / A p p l D o c T y p e _ S a l e s C r M e m o H e a d e r > 
-                 < A p p l y t o N u m b e r C a p t i o n > A p p l y t o N u m b e r C a p t i o n < / A p p l y t o N u m b e r C a p t i o n > 
-                 < A p p l y t o T y p e C a p t i o n > A p p l y t o T y p e C a p t i o n < / A p p l y t o T y p e C a p t i o n > 
-                 < B i l l C a p t i o n > B i l l C a p t i o n < / B i l l C a p t i o n > 
-                 < B i l l T o A d d r e s s 1 > B i l l T o A d d r e s s 1 < / B i l l T o A d d r e s s 1 > 
-                 < B i l l T o A d d r e s s 2 > B i l l T o A d d r e s s 2 < / B i l l T o A d d r e s s 2 > 
-                 < B i l l T o A d d r e s s 3 > B i l l T o A d d r e s s 3 < / B i l l T o A d d r e s s 3 > 
-                 < B i l l T o A d d r e s s 4 > B i l l T o A d d r e s s 4 < / B i l l T o A d d r e s s 4 > 
-                 < B i l l T o A d d r e s s 5 > B i l l T o A d d r e s s 5 < / B i l l T o A d d r e s s 5 > 
-                 < B i l l T o A d d r e s s 6 > B i l l T o A d d r e s s 6 < / B i l l T o A d d r e s s 6 > 
-                 < B i l l T o A d d r e s s 7 > B i l l T o A d d r e s s 7 < / B i l l T o A d d r e s s 7 > 
-                 < B i l l T o A d d r e s s 8 > B i l l T o A d d r e s s 8 < / B i l l T o A d d r e s s 8 > 
-                 < B i l l t o C u s t N o _ S a l e s C r M e m o H e a d e r > B i l l t o C u s t N o _ S a l e s C r M e m o H e a d e r < / B i l l t o C u s t N o _ S a l e s C r M e m o H e a d e r > 
-                 < B i l l t o C u s t o m e r N o _ L b l > B i l l t o C u s t o m e r N o _ L b l < / B i l l t o C u s t o m e r N o _ L b l > 
-                 < B i l l t o C u s t u m e r N o > B i l l t o C u s t u m e r N o < / B i l l t o C u s t u m e r N o > 
-                 < C o m m e n t s L b l > C o m m e n t s L b l < / C o m m e n t s L b l > 
-                 < C o m p a n y A d d r e s s 1 > C o m p a n y A d d r e s s 1 < / C o m p a n y A d d r e s s 1 > 
-                 < C o m p a n y A d d r e s s 2 > C o m p a n y A d d r e s s 2 < / C o m p a n y A d d r e s s 2 > 
-                 < C o m p a n y A d d r e s s 3 > C o m p a n y A d d r e s s 3 < / C o m p a n y A d d r e s s 3 > 
-                 < C o m p a n y A d d r e s s 4 > C o m p a n y A d d r e s s 4 < / C o m p a n y A d d r e s s 4 > 
-                 < C o m p a n y A d d r e s s 5 > C o m p a n y A d d r e s s 5 < / C o m p a n y A d d r e s s 5 > 
-                 < C o m p a n y A d d r e s s 6 > C o m p a n y A d d r e s s 6 < / C o m p a n y A d d r e s s 6 > 
-                 < C o m p a n y A d d r e s s 7 > C o m p a n y A d d r e s s 7 < / C o m p a n y A d d r e s s 7 > 
-                 < C o m p a n y A d d r e s s 8 > C o m p a n y A d d r e s s 8 < / C o m p a n y A d d r e s s 8 > 
-                 < C o m p a n y I n f o 1 P i c t u r e   / > 
-                 < C o m p a n y I n f o 2 P i c t u r e   / > 
-                 < C o m p a n y I n f o 3 P i c t u r e   / > 
-                 < C o p y N o > C o p y N o < / C o p y N o > 
-                 < C o p y T x t > C o p y T x t < / C o p y T x t > 
-                 < C r e d i t C a p t i o n > C r e d i t C a p t i o n < / C r e d i t C a p t i o n > 
-                 < C r e d i t M e m o C a p t i o n > C r e d i t M e m o C a p t i o n < / C r e d i t M e m o C a p t i o n > 
-                 < C r e d i t M e m o D a t e C a p t i o n > C r e d i t M e m o D a t e C a p t i o n < / C r e d i t M e m o D a t e C a p t i o n > 
-                 < C r e d i t M e m o N u m b e r C a p t i o n > C r e d i t M e m o N u m b e r C a p t i o n < / C r e d i t M e m o N u m b e r C a p t i o n > 
-                 < C u s t o m e r I D C a p t i o n > C u s t o m e r I D C a p t i o n < / C u s t o m e r I D C a p t i o n > 
-                 < D o c D a t e _ S a l e s C r M e m o H e a d e r > D o c D a t e _ S a l e s C r M e m o H e a d e r < / D o c D a t e _ S a l e s C r M e m o H e a d e r > 
-                 < D o c u m e n t N o > D o c u m e n t N o < / D o c u m e n t N o > 
-                 < D o c u m e n t N o _ L b l > D o c u m e n t N o _ L b l < / D o c u m e n t N o _ L b l > 
-                 < D o c u m e n t T i t l e _ L b l > D o c u m e n t T i t l e _ L b l < / D o c u m e n t T i t l e _ L b l > 
-                 < D u e D a t e > D u e D a t e < / D u e D a t e > 
-                 < D u e D a t e _ L b l > D u e D a t e _ L b l < / D u e D a t e _ L b l > 
-                 < E x t D o c N o _ S a l e s C r M e m o H e a d e r > E x t D o c N o _ S a l e s C r M e m o H e a d e r < / E x t D o c N o _ S a l e s C r M e m o H e a d e r > 
-                 < N A C C o m p a n y A d d r e s s 1 > N A C C o m p a n y A d d r e s s 1 < / N A C C o m p a n y A d d r e s s 1 > 
-                 < N A C C o m p a n y A d d r e s s 2 > N A C C o m p a n y A d d r e s s 2 < / N A C C o m p a n y A d d r e s s 2 > 
-                 < N A C C o m p a n y A d d r e s s 3 > N A C C o m p a n y A d d r e s s 3 < / N A C C o m p a n y A d d r e s s 3 > 
-                 < N A C C o m p a n y A d d r e s s 4 > N A C C o m p a n y A d d r e s s 4 < / N A C C o m p a n y A d d r e s s 4 > 
-                 < N A C C o m p a n y A d d r e s s 5 > N A C C o m p a n y A d d r e s s 5 < / N A C C o m p a n y A d d r e s s 5 > 
-                 < N A C C o m p a n y A d d r e s s 6 > N A C C o m p a n y A d d r e s s 6 < / N A C C o m p a n y A d d r e s s 6 > 
-                 < N A C C o m p a n y A d d r e s s 7 > N A C C o m p a n y A d d r e s s 7 < / N A C C o m p a n y A d d r e s s 7 > 
-                 < N A C C o m p a n y A d d r e s s 8 > N A C C o m p a n y A d d r e s s 8 < / N A C C o m p a n y A d d r e s s 8 > 
-                 < N A C Y o u r R e f e r e n c e > N A C Y o u r R e f e r e n c e < / N A C Y o u r R e f e r e n c e > 
-                 < p a c k a g e N o > p a c k a g e N o < / p a c k a g e N o > 
-                 < P a g e C a p t i o n > P a g e C a p t i o n < / P a g e C a p t i o n > 
-                 < P O N u m b e r C a p t i o n > P O N u m b e r C a p t i o n < / P O N u m b e r C a p t i o n > 
-                 < P r i n t F o o t e r > P r i n t F o o t e r < / P r i n t F o o t e r > 
-                 < S a l e s P e r s o n C a p t i o n > S a l e s P e r s o n C a p t i o n < / S a l e s P e r s o n C a p t i o n > 
-                 < S a l e s P u r c h P e r s o n N a m e > S a l e s P u r c h P e r s o n N a m e < / S a l e s P u r c h P e r s o n N a m e > 
-                 < S h i p C a p t i o n > S h i p C a p t i o n < / S h i p C a p t i o n > 
-                 < S h i p D a t e C a p t i o n > S h i p D a t e C a p t i o n < / S h i p D a t e C a p t i o n > 
-                 < S h i p p i n g A g e n t > S h i p p i n g A g e n t < / S h i p p i n g A g e n t > 
-                 < S h i p T o A d d r e s s 1 > S h i p T o A d d r e s s 1 < / S h i p T o A d d r e s s 1 > 
-                 < S h i p T o A d d r e s s 2 > S h i p T o A d d r e s s 2 < / S h i p T o A d d r e s s 2 > 
-                 < S h i p T o A d d r e s s 3 > S h i p T o A d d r e s s 3 < / S h i p T o A d d r e s s 3 > 
-                 < S h i p T o A d d r e s s 4 > S h i p T o A d d r e s s 4 < / S h i p T o A d d r e s s 4 > 
-                 < S h i p T o A d d r e s s 5 > S h i p T o A d d r e s s 5 < / S h i p T o A d d r e s s 5 > 
-                 < S h i p T o A d d r e s s 6 > S h i p T o A d d r e s s 6 < / S h i p T o A d d r e s s 6 > 
-                 < S h i p T o A d d r e s s 7 > S h i p T o A d d r e s s 7 < / S h i p T o A d d r e s s 7 > 
-                 < S h i p T o A d d r e s s 8 > S h i p T o A d d r e s s 8 < / S h i p T o A d d r e s s 8 > 
-                 < S h p t D a t e _ S a l e s C r M e m o H e a d e r > S h p t D a t e _ S a l e s C r M e m o H e a d e r < / S h p t D a t e _ S a l e s C r M e m o H e a d e r > 
-                 < T a x I d e n t T y p e C a p t i o n > T a x I d e n t T y p e C a p t i o n < / T a x I d e n t T y p e C a p t i o n > 
-                 < T a x I d e n t T y p e _ C u s t > T a x I d e n t T y p e _ C u s t < / T a x I d e n t T y p e _ C u s t > 
-                 < T a x R e g L a b e l > T a x R e g L a b e l < / T a x R e g L a b e l > 
-                 < T a x R e g N o > T a x R e g N o < / T a x R e g N o > 
-                 < T o C a p t i o n > T o C a p t i o n < / T o C a p t i o n > 
-                 < T o t a l A m o u n t I n c l V A T > T o t a l A m o u n t I n c l V A T < / T o t a l A m o u n t I n c l V A T > 
-                 < W o r k D e s c r i p t i o n > W o r k D e s c r i p t i o n < / W o r k D e s c r i p t i o n > 
-                 < S a l e s C r M e m o L i n e > 
-                     < A m o u n t E x c l I n v D i s c > A m o u n t E x c l I n v D i s c < / A m o u n t E x c l I n v D i s c > 
-                     < A m o u n t E x e m p t f r o m S a l e s T a x C a p t i o n > A m o u n t E x e m p t f r o m S a l e s T a x C a p t i o n < / A m o u n t E x e m p t f r o m S a l e s T a x C a p t i o n > 
-                     < A m o u n t S u b j e c t t o S a l e s T a x C a p t i o n > A m o u n t S u b j e c t t o S a l e s T a x C a p t i o n < / A m o u n t S u b j e c t t o S a l e s T a x C a p t i o n > 
-                     < B r e a k d o w n A m t 1 > B r e a k d o w n A m t 1 < / B r e a k d o w n A m t 1 > 
-                     < B r e a k d o w n A m t 2 > B r e a k d o w n A m t 2 < / B r e a k d o w n A m t 2 > 
-                     < B r e a k d o w n A m t 3 > B r e a k d o w n A m t 3 < / B r e a k d o w n A m t 3 > 
-                     < B r e a k d o w n A m t 4 > B r e a k d o w n A m t 4 < / B r e a k d o w n A m t 4 > 
-                     < B r e a k d o w n L a b e l 1 > B r e a k d o w n L a b e l 1 < / B r e a k d o w n L a b e l 1 > 
-                     < B r e a k d o w n L a b e l 2 > B r e a k d o w n L a b e l 2 < / B r e a k d o w n L a b e l 2 > 
-                     < B r e a k d o w n L a b e l 3 > B r e a k d o w n L a b e l 3 < / B r e a k d o w n L a b e l 3 > 
-                     < B r e a k d o w n L a b e l 4 > B r e a k d o w n L a b e l 4 < / B r e a k d o w n L a b e l 4 > 
-                     < B r e a k d o w n T i t l e > B r e a k d o w n T i t l e < / B r e a k d o w n T i t l e > 
-                     < D e s c r i p t i o n C a p t i o n > D e s c r i p t i o n C a p t i o n < / D e s c r i p t i o n C a p t i o n > 
-                     < I n v o i c e D i s c o u n t C a p t i o n > I n v o i c e D i s c o u n t C a p t i o n < / I n v o i c e D i s c o u n t C a p t i o n > 
-                     < I t e m N o C a p t i o n > I t e m N o C a p t i o n < / I t e m N o C a p t i o n > 
-                     < Q u a n t i t y C a p t i o n > Q u a n t i t y C a p t i o n < / Q u a n t i t y C a p t i o n > 
-                     < S u b t o t a l C a p t i o n > S u b t o t a l C a p t i o n < / S u b t o t a l C a p t i o n > 
-                     < T a x L i a b l e > T a x L i a b l e < / T a x L i a b l e > 
-                     < T e m p S a l e s C r M e m o L i n e A m t A m t E x c l I n v D i s c > T e m p S a l e s C r M e m o L i n e A m t A m t E x c l I n v D i s c < / T e m p S a l e s C r M e m o L i n e A m t A m t E x c l I n v D i s c > 
-                     < T e m p S a l e s C r M e m o L i n e A m t I n c l V A T > T e m p S a l e s C r M e m o L i n e A m t I n c l V A T < / T e m p S a l e s C r M e m o L i n e A m t I n c l V A T > 
-                     < T e m p S a l e s C r M e m o L i n e A m t I n c l V A T A m t > T e m p S a l e s C r M e m o L i n e A m t I n c l V A T A m t < / T e m p S a l e s C r M e m o L i n e A m t I n c l V A T A m t > 
-                     < T e m p S a l e s C r M e m o L i n e A m t T a x L i a b l e > T e m p S a l e s C r M e m o L i n e A m t T a x L i a b l e < / T e m p S a l e s C r M e m o L i n e A m t T a x L i a b l e > 
-                     < T e m p S a l e s C r M e m o L i n e D e s c > T e m p S a l e s C r M e m o L i n e D e s c < / T e m p S a l e s C r M e m o L i n e D e s c > 
-                     < T e m p S a l e s C r M e m o L i n e N o > T e m p S a l e s C r M e m o L i n e N o < / T e m p S a l e s C r M e m o L i n e N o > 
-                     < T e m p S a l e s C r M e m o L i n e Q t y > T e m p S a l e s C r M e m o L i n e Q t y < / T e m p S a l e s C r M e m o L i n e Q t y > 
-                     < T e m p S a l e s C r M e m o L i n e U O M > T e m p S a l e s C r M e m o L i n e U O M < / T e m p S a l e s C r M e m o L i n e U O M > 
-                     < T o t a l C a p t i o n > T o t a l C a p t i o n < / T o t a l C a p t i o n > 
-                     < T o t a l P r i c e C a p t i o n > T o t a l P r i c e C a p t i o n < / T o t a l P r i c e C a p t i o n > 
-                     < T o t a l T a x L a b e l > T o t a l T a x L a b e l < / T o t a l T a x L a b e l > 
-                     < U n i t C a p t i o n > U n i t C a p t i o n < / U n i t C a p t i o n > 
-                     < U n i t P r i c e C a p t i o n > U n i t P r i c e C a p t i o n < / U n i t P r i c e C a p t i o n > 
-                     < U n i t P r i c e T o P r i n t > U n i t P r i c e T o P r i n t < / U n i t P r i c e T o P r i n t > 
-                 < / S a l e s C r M e m o L i n e > 
-             < / P a g e L o o p > 
-         < / C o p y L o o p > 
-         < L e t t e r T e x t > 
-             < B o d y T e x t > B o d y T e x t < / B o d y T e x t > 
-             < C l o s i n g T e x t > C l o s i n g T e x t < / C l o s i n g T e x t > 
-             < G r e e t i n g T e x t > G r e e t i n g T e x t < / G r e e t i n g T e x t > 
-         < / L e t t e r T e x t > 
-     < / S a l e s _ C r _ M e m o _ H e a d e r > 
+<file path=customXml/item3.xml>��< ? x m l   v e r s i o n = " 1 . 0 "   e n c o d i n g = " u t f - 1 6 " ? > + 
+ < N a v W o r d R e p o r t X m l P a r t   x m l n s = " u r n : m i c r o s o f t - d y n a m i c s - n a v / r e p o r t s / S a l e s _ C r e d i t _ M e m o _ N A / 1 0 0 7 3 / " > + 
+     < B C R e p o r t I n f o r m a t i o n > + 
+         < R e p o r t M e t a d a t a > + 
+             < E x t e n s i o n I d > E x t e n s i o n   I D < / E x t e n s i o n I d > + 
+             < E x t e n s i o n N a m e > E x t e n s i o n   N a m e < / E x t e n s i o n N a m e > + 
+             < E x t e n s i o n P u b l i s h e r > E x t e n s i o n   P u b l i s h e r < / E x t e n s i o n P u b l i s h e r > + 
+             < E x t e n s i o n V e r s i o n > E x t e n s i o n   V e r s i o n < / E x t e n s i o n V e r s i o n > + 
+             < R e p o r t I d > R e p o r t   I D < / R e p o r t I d > + 
+             < R e p o r t N a m e > R e p o r t   N a m e < / R e p o r t N a m e > + 
+             < A b o u t T h i s R e p o r t T i t l e > A b o u t   T h i s   R e p o r t   T i t l e < / A b o u t T h i s R e p o r t T i t l e > + 
+             < A b o u t T h i s R e p o r t T e x t > A b o u t   T h i s   R e p o r t   T e x t < / A b o u t T h i s R e p o r t T e x t > + 
+             < R e p o r t H e l p L i n k > R e p o r t   H e l p   L i n k < / R e p o r t H e l p L i n k > + 
+         < / R e p o r t M e t a d a t a > + 
+         < R e p o r t R e q u e s t > + 
+             < T e n a n t E n t r a I d > T e n a n t   E n t r a   I d < / T e n a n t E n t r a I d > + 
+             < E n v i r o n m e n t N a m e > E n v i r o n m e n t   N a m e < / E n v i r o n m e n t N a m e > + 
+             < E n v i r o n m e n t T y p e > E n v i r o n m e n t   T y p e < / E n v i r o n m e n t T y p e > + 
+             < C o m p a n y N a m e > C o m p a n y   N a m e < / C o m p a n y N a m e > + 
+             < C o m p a n y D i s p l a y N a m e > C o m p a n y   D i s p l a y   N a m e < / C o m p a n y D i s p l a y N a m e > + 
+             < C o m p a n y I d > C o m p a n y   I D < / C o m p a n y I d > + 
+             < U s e r N a m e > U s e r   N a m e < / U s e r N a m e > + 
+             < D a t e A n d T i m e > D a t e   a n d   T i m e < / D a t e A n d T i m e > + 
+             < L a n g u a g e > L a n g u a g e < / L a n g u a g e > + 
+             < F o r m a t R e g i o n > F o r m a t   R e g i o n < / F o r m a t R e g i o n > + 
+             < D a t e T i m e V a l u e s > + 
+                 < Y e a r > Y e a r < / Y e a r > + 
+                 < M o n t h N u m b e r > M o n t h   N u m b e r < / M o n t h N u m b e r > + 
+                 < D a y N u m b e r > D a y   N u m b e r < / D a y N u m b e r > + 
+                 < H o u r > H o u r < / H o u r > + 
+                 < M i n u t e > M i n u t e < / M i n u t e > + 
+             < / D a t e T i m e V a l u e s > + 
+         < / R e p o r t R e q u e s t > + 
+     < / B C R e p o r t I n f o r m a t i o n > + 
+     < S a l e s _ C r _ M e m o _ H e a d e r > + 
+         < N o _ S a l e s C r M e m o H e a d e r > N o _ S a l e s C r M e m o H e a d e r < / N o _ S a l e s C r M e m o H e a d e r > + 
+         < N o _ S a l e s H e a d e r > N o _ S a l e s H e a d e r < / N o _ S a l e s H e a d e r > + 
+         < S a l e s _ C r _ M e m o _ L i n e > + 
+             < S a l e s L i n e C o m m e n t s   / > + 
+         < / S a l e s _ C r _ M e m o _ L i n e > + 
+         < S a l e s _ C o m m e n t _ L i n e   / > + 
+         < C o p y L o o p > + 
+             < P a g e L o o p > + 
+                 < A p p l D o c N o _ S a l e s C r M e m o H e a d e r > A p p l D o c N o _ S a l e s C r M e m o H e a d e r < / A p p l D o c N o _ S a l e s C r M e m o H e a d e r > + 
+                 < A p p l D o c T y p e _ S a l e s C r M e m o H e a d e r > A p p l D o c T y p e _ S a l e s C r M e m o H e a d e r < / A p p l D o c T y p e _ S a l e s C r M e m o H e a d e r > + 
+                 < A p p l y t o N u m b e r C a p t i o n > A p p l y t o N u m b e r C a p t i o n < / A p p l y t o N u m b e r C a p t i o n > + 
+                 < A p p l y t o T y p e C a p t i o n > A p p l y t o T y p e C a p t i o n < / A p p l y t o T y p e C a p t i o n > + 
+                 < B i l l C a p t i o n > B i l l C a p t i o n < / B i l l C a p t i o n > + 
+                 < B i l l T o A d d r e s s 1 > B i l l T o A d d r e s s 1 < / B i l l T o A d d r e s s 1 > + 
+                 < B i l l T o A d d r e s s 2 > B i l l T o A d d r e s s 2 < / B i l l T o A d d r e s s 2 > + 
+                 < B i l l T o A d d r e s s 3 > B i l l T o A d d r e s s 3 < / B i l l T o A d d r e s s 3 > + 
+                 < B i l l T o A d d r e s s 4 > B i l l T o A d d r e s s 4 < / B i l l T o A d d r e s s 4 > + 
+                 < B i l l T o A d d r e s s 5 > B i l l T o A d d r e s s 5 < / B i l l T o A d d r e s s 5 > + 
+                 < B i l l T o A d d r e s s 6 > B i l l T o A d d r e s s 6 < / B i l l T o A d d r e s s 6 > + 
+                 < B i l l T o A d d r e s s 7 > B i l l T o A d d r e s s 7 < / B i l l T o A d d r e s s 7 > + 
+                 < B i l l T o A d d r e s s 8 > B i l l T o A d d r e s s 8 < / B i l l T o A d d r e s s 8 > + 
+                 < B i l l t o C u s t N o _ S a l e s C r M e m o H e a d e r > B i l l t o C u s t N o _ S a l e s C r M e m o H e a d e r < / B i l l t o C u s t N o _ S a l e s C r M e m o H e a d e r > + 
+                 < B i l l t o C u s t o m e r N o _ L b l > B i l l t o C u s t o m e r N o _ L b l < / B i l l t o C u s t o m e r N o _ L b l > + 
+                 < B i l l t o C u s t u m e r N o > B i l l t o C u s t u m e r N o < / B i l l t o C u s t u m e r N o > + 
+                 < C o m m e n t s L b l > C o m m e n t s L b l < / C o m m e n t s L b l > + 
+                 < C o m p a n y A d d r e s s 1 > C o m p a n y A d d r e s s 1 < / C o m p a n y A d d r e s s 1 > + 
+                 < C o m p a n y A d d r e s s 2 > C o m p a n y A d d r e s s 2 < / C o m p a n y A d d r e s s 2 > + 
+                 < C o m p a n y A d d r e s s 3 > C o m p a n y A d d r e s s 3 < / C o m p a n y A d d r e s s 3 > + 
+                 < C o m p a n y A d d r e s s 4 > C o m p a n y A d d r e s s 4 < / C o m p a n y A d d r e s s 4 > + 
+                 < C o m p a n y A d d r e s s 5 > C o m p a n y A d d r e s s 5 < / C o m p a n y A d d r e s s 5 > + 
+                 < C o m p a n y A d d r e s s 6 > C o m p a n y A d d r e s s 6 < / C o m p a n y A d d r e s s 6 > + 
+                 < C o m p a n y A d d r e s s 7 > C o m p a n y A d d r e s s 7 < / C o m p a n y A d d r e s s 7 > + 
+                 < C o m p a n y A d d r e s s 8 > C o m p a n y A d d r e s s 8 < / C o m p a n y A d d r e s s 8 > + 
+                 < C o m p a n y I n f o 1 P i c t u r e   / > + 
+                 < C o m p a n y I n f o 2 P i c t u r e   / > + 
+                 < C o m p a n y I n f o 3 P i c t u r e   / > + 
+                 < C o p y N o > C o p y N o < / C o p y N o > + 
+                 < C o p y T x t > C o p y T x t < / C o p y T x t > + 
+                 < C r e d i t C a p t i o n > C r e d i t C a p t i o n < / C r e d i t C a p t i o n > + 
+                 < C r e d i t M e m o C a p t i o n > C r e d i t M e m o C a p t i o n < / C r e d i t M e m o C a p t i o n > + 
+                 < C r e d i t M e m o D a t e C a p t i o n > C r e d i t M e m o D a t e C a p t i o n < / C r e d i t M e m o D a t e C a p t i o n > + 
+                 < C r e d i t M e m o N u m b e r C a p t i o n > C r e d i t M e m o N u m b e r C a p t i o n < / C r e d i t M e m o N u m b e r C a p t i o n > + 
+                 < C u s t o m e r I D C a p t i o n > C u s t o m e r I D C a p t i o n < / C u s t o m e r I D C a p t i o n > + 
+                 < D o c D a t e _ S a l e s C r M e m o H e a d e r > D o c D a t e _ S a l e s C r M e m o H e a d e r < / D o c D a t e _ S a l e s C r M e m o H e a d e r > + 
+                 < D o c u m e n t N o > D o c u m e n t N o < / D o c u m e n t N o > + 
+                 < D o c u m e n t N o _ L b l > D o c u m e n t N o _ L b l < / D o c u m e n t N o _ L b l > + 
+                 < D o c u m e n t T i t l e _ L b l > D o c u m e n t T i t l e _ L b l < / D o c u m e n t T i t l e _ L b l > + 
+                 < D u e D a t e > D u e D a t e < / D u e D a t e > + 
+                 < D u e D a t e _ L b l > D u e D a t e _ L b l < / D u e D a t e _ L b l > + 
+                 < E x t D o c N o _ S a l e s C r M e m o H e a d e r > E x t D o c N o _ S a l e s C r M e m o H e a d e r < / E x t D o c N o _ S a l e s C r M e m o H e a d e r > + 
+                 < N A C C o m p a n y A d d r e s s 1 > N A C C o m p a n y A d d r e s s 1 < / N A C C o m p a n y A d d r e s s 1 > + 
+                 < N A C C o m p a n y A d d r e s s 2 > N A C C o m p a n y A d d r e s s 2 < / N A C C o m p a n y A d d r e s s 2 > + 
+                 < N A C C o m p a n y A d d r e s s 3 > N A C C o m p a n y A d d r e s s 3 < / N A C C o m p a n y A d d r e s s 3 > + 
+                 < N A C C o m p a n y A d d r e s s 4 > N A C C o m p a n y A d d r e s s 4 < / N A C C o m p a n y A d d r e s s 4 > + 
+                 < N A C C o m p a n y A d d r e s s 5 > N A C C o m p a n y A d d r e s s 5 < / N A C C o m p a n y A d d r e s s 5 > + 
+                 < N A C C o m p a n y A d d r e s s 6 > N A C C o m p a n y A d d r e s s 6 < / N A C C o m p a n y A d d r e s s 6 > + 
+                 < N A C C o m p a n y A d d r e s s 7 > N A C C o m p a n y A d d r e s s 7 < / N A C C o m p a n y A d d r e s s 7 > + 
+                 < N A C C o m p a n y A d d r e s s 8 > N A C C o m p a n y A d d r e s s 8 < / N A C C o m p a n y A d d r e s s 8 > + 
+                 < N A C Y o u r R e f e r e n c e > N A C Y o u r R e f e r e n c e < / N A C Y o u r R e f e r e n c e > + 
+                 < p a c k a g e N o > p a c k a g e N o < / p a c k a g e N o > + 
+                 < P a g e C a p t i o n > P a g e C a p t i o n < / P a g e C a p t i o n > + 
+                 < P O N u m b e r C a p t i o n > P O N u m b e r C a p t i o n < / P O N u m b e r C a p t i o n > + 
+                 < P r i n t F o o t e r > P r i n t F o o t e r < / P r i n t F o o t e r > + 
+                 < S a l e s P e r s o n C a p t i o n > S a l e s P e r s o n C a p t i o n < / S a l e s P e r s o n C a p t i o n > + 
+                 < S a l e s P u r c h P e r s o n N a m e > S a l e s P u r c h P e r s o n N a m e < / S a l e s P u r c h P e r s o n N a m e > + 
+                 < S h i p C a p t i o n > S h i p C a p t i o n < / S h i p C a p t i o n > + 
+                 < S h i p D a t e C a p t i o n > S h i p D a t e C a p t i o n < / S h i p D a t e C a p t i o n > + 
+                 < S h i p p i n g A g e n t > S h i p p i n g A g e n t < / S h i p p i n g A g e n t > + 
+                 < S h i p T o A d d r e s s 1 > S h i p T o A d d r e s s 1 < / S h i p T o A d d r e s s 1 > + 
+                 < S h i p T o A d d r e s s 2 > S h i p T o A d d r e s s 2 < / S h i p T o A d d r e s s 2 > + 
+                 < S h i p T o A d d r e s s 3 > S h i p T o A d d r e s s 3 < / S h i p T o A d d r e s s 3 > + 
+                 < S h i p T o A d d r e s s 4 > S h i p T o A d d r e s s 4 < / S h i p T o A d d r e s s 4 > + 
+                 < S h i p T o A d d r e s s 5 > S h i p T o A d d r e s s 5 < / S h i p T o A d d r e s s 5 > + 
+                 < S h i p T o A d d r e s s 6 > S h i p T o A d d r e s s 6 < / S h i p T o A d d r e s s 6 > + 
+                 < S h i p T o A d d r e s s 7 > S h i p T o A d d r e s s 7 < / S h i p T o A d d r e s s 7 > + 
+                 < S h i p T o A d d r e s s 8 > S h i p T o A d d r e s s 8 < / S h i p T o A d d r e s s 8 > + 
+                 < S h p t D a t e _ S a l e s C r M e m o H e a d e r > S h p t D a t e _ S a l e s C r M e m o H e a d e r < / S h p t D a t e _ S a l e s C r M e m o H e a d e r > + 
+                 < T a x I d e n t T y p e C a p t i o n > T a x I d e n t T y p e C a p t i o n < / T a x I d e n t T y p e C a p t i o n > + 
+                 < T a x I d e n t T y p e _ C u s t > T a x I d e n t T y p e _ C u s t < / T a x I d e n t T y p e _ C u s t > + 
+                 < T a x R e g L a b e l > T a x R e g L a b e l < / T a x R e g L a b e l > + 
+                 < T a x R e g N o > T a x R e g N o < / T a x R e g N o > + 
+                 < T o C a p t i o n > T o C a p t i o n < / T o C a p t i o n > + 
+                 < T o t a l A m o u n t I n c l V A T > T o t a l A m o u n t I n c l V A T < / T o t a l A m o u n t I n c l V A T > + 
+                 < W o r k D e s c r i p t i o n > W o r k D e s c r i p t i o n < / W o r k D e s c r i p t i o n > + 
+                 < S a l e s C r M e m o L i n e > + 
+                     < A m o u n t E x c l I n v D i s c > A m o u n t E x c l I n v D i s c < / A m o u n t E x c l I n v D i s c > + 
+                     < A m o u n t E x e m p t f r o m S a l e s T a x C a p t i o n > A m o u n t E x e m p t f r o m S a l e s T a x C a p t i o n < / A m o u n t E x e m p t f r o m S a l e s T a x C a p t i o n > + 
+                     < A m o u n t S u b j e c t t o S a l e s T a x C a p t i o n > A m o u n t S u b j e c t t o S a l e s T a x C a p t i o n < / A m o u n t S u b j e c t t o S a l e s T a x C a p t i o n > + 
+                     < B r e a k d o w n A m t 1 > B r e a k d o w n A m t 1 < / B r e a k d o w n A m t 1 > + 
+                     < B r e a k d o w n A m t 2 > B r e a k d o w n A m t 2 < / B r e a k d o w n A m t 2 > + 
+                     < B r e a k d o w n A m t 3 > B r e a k d o w n A m t 3 < / B r e a k d o w n A m t 3 > + 
+                     < B r e a k d o w n A m t 4 > B r e a k d o w n A m t 4 < / B r e a k d o w n A m t 4 > + 
+                     < B r e a k d o w n L a b e l 1 > B r e a k d o w n L a b e l 1 < / B r e a k d o w n L a b e l 1 > + 
+                     < B r e a k d o w n L a b e l 2 > B r e a k d o w n L a b e l 2 < / B r e a k d o w n L a b e l 2 > + 
+                     < B r e a k d o w n L a b e l 3 > B r e a k d o w n L a b e l 3 < / B r e a k d o w n L a b e l 3 > + 
+                     < B r e a k d o w n L a b e l 4 > B r e a k d o w n L a b e l 4 < / B r e a k d o w n L a b e l 4 > + 
+                     < B r e a k d o w n T i t l e > B r e a k d o w n T i t l e < / B r e a k d o w n T i t l e > + 
+                     < D e s c r i p t i o n C a p t i o n > D e s c r i p t i o n C a p t i o n < / D e s c r i p t i o n C a p t i o n > + 
+                     < I n v o i c e D i s c o u n t C a p t i o n > I n v o i c e D i s c o u n t C a p t i o n < / I n v o i c e D i s c o u n t C a p t i o n > + 
+                     < I t e m N o C a p t i o n > I t e m N o C a p t i o n < / I t e m N o C a p t i o n > + 
+                     < Q u a n t i t y C a p t i o n > Q u a n t i t y C a p t i o n < / Q u a n t i t y C a p t i o n > + 
+                     < S u b t o t a l C a p t i o n > S u b t o t a l C a p t i o n < / S u b t o t a l C a p t i o n > + 
+                     < T a x L i a b l e > T a x L i a b l e < / T a x L i a b l e > + 
+                     < T e m p S a l e s C r M e m o L i n e A m t A m t E x c l I n v D i s c > T e m p S a l e s C r M e m o L i n e A m t A m t E x c l I n v D i s c < / T e m p S a l e s C r M e m o L i n e A m t A m t E x c l I n v D i s c > + 
+                     < T e m p S a l e s C r M e m o L i n e A m t I n c l V A T > T e m p S a l e s C r M e m o L i n e A m t I n c l V A T < / T e m p S a l e s C r M e m o L i n e A m t I n c l V A T > + 
+                     < T e m p S a l e s C r M e m o L i n e A m t I n c l V A T A m t > T e m p S a l e s C r M e m o L i n e A m t I n c l V A T A m t < / T e m p S a l e s C r M e m o L i n e A m t I n c l V A T A m t > + 
+                     < T e m p S a l e s C r M e m o L i n e A m t T a x L i a b l e > T e m p S a l e s C r M e m o L i n e A m t T a x L i a b l e < / T e m p S a l e s C r M e m o L i n e A m t T a x L i a b l e > + 
+                     < T e m p S a l e s C r M e m o L i n e D e s c > T e m p S a l e s C r M e m o L i n e D e s c < / T e m p S a l e s C r M e m o L i n e D e s c > + 
+                     < T e m p S a l e s C r M e m o L i n e N o > T e m p S a l e s C r M e m o L i n e N o < / T e m p S a l e s C r M e m o L i n e N o > + 
+                     < T e m p S a l e s C r M e m o L i n e Q t y > T e m p S a l e s C r M e m o L i n e Q t y < / T e m p S a l e s C r M e m o L i n e Q t y > + 
+                     < T e m p S a l e s C r M e m o L i n e U O M > T e m p S a l e s C r M e m o L i n e U O M < / T e m p S a l e s C r M e m o L i n e U O M > + 
+                     < T o t a l C a p t i o n > T o t a l C a p t i o n < / T o t a l C a p t i o n > + 
+                     < T o t a l P r i c e C a p t i o n > T o t a l P r i c e C a p t i o n < / T o t a l P r i c e C a p t i o n > + 
+                     < T o t a l T a x L a b e l > T o t a l T a x L a b e l < / T o t a l T a x L a b e l > + 
+                     < U n i t C a p t i o n > U n i t C a p t i o n < / U n i t C a p t i o n > + 
+                     < U n i t P r i c e C a p t i o n > U n i t P r i c e C a p t i o n < / U n i t P r i c e C a p t i o n > + 
+                     < U n i t P r i c e T o P r i n t > U n i t P r i c e T o P r i n t < / U n i t P r i c e T o P r i n t > + 
+                 < / S a l e s C r M e m o L i n e > + 
+             < / P a g e L o o p > + 
+         < / C o p y L o o p > + 
+         < L e t t e r T e x t > + 
+             < B o d y T e x t > B o d y T e x t < / B o d y T e x t > + 
+             < C l o s i n g T e x t > C l o s i n g T e x t < / C l o s i n g T e x t > + 
+             < G r e e t i n g T e x t > G r e e t i n g T e x t < / G r e e t i n g T e x t > + 
+         < / L e t t e r T e x t > + 
+     < / S a l e s _ C r _ M e m o _ H e a d e r > + 
  < / N a v W o r d R e p o r t X m l P a r t > 
 </file>
 

</xml_diff>